<commit_message>
Added HR cases template
</commit_message>
<xml_diff>
--- a/docs/הוראות הפעלה למערכת.docx
+++ b/docs/הוראות הפעלה למערכת.docx
@@ -12,7 +12,6 @@
           <w:sz w:val="32"/>
           <w:szCs w:val="32"/>
           <w:u w:val="single"/>
-          <w:rtl/>
           <w14:shadow w14:blurRad="38100" w14:dist="19050" w14:dir="2700000" w14:sx="100000" w14:sy="100000" w14:kx="0" w14:ky="0" w14:algn="tl">
             <w14:schemeClr w14:val="dk1">
               <w14:alpha w14:val="60000"/>
@@ -25,7 +24,10 @@
           </w14:textOutline>
         </w:rPr>
       </w:pPr>
-      <w:r>
+    </w:p>
+    <w:p>
+      <w:pPr>
+        <w:bidi/>
         <w:rPr>
           <w:rFonts w:asciiTheme="minorBidi" w:hAnsiTheme="minorBidi" w:cstheme="minorBidi"/>
           <w:b/>
@@ -45,80 +47,8 @@
             <w14:round/>
           </w14:textOutline>
         </w:rPr>
-        <w:t>הוראות הפעלה:</w:t>
-      </w:r>
-    </w:p>
-    <w:p>
-      <w:pPr>
-        <w:bidi/>
-        <w:rPr>
-          <w:rtl/>
-        </w:rPr>
-      </w:pPr>
-      <w:r>
-        <w:rPr>
-          <w:rFonts w:hint="cs"/>
-          <w:rtl/>
-        </w:rPr>
-        <w:t>למשתמש יוצג תפריט בעל 3 אופציות כניסה למערכת:</w:t>
-      </w:r>
-    </w:p>
-    <w:p>
-      <w:pPr>
-        <w:bidi/>
-        <w:rPr>
-          <w:rtl/>
-        </w:rPr>
-      </w:pPr>
-      <w:r>
-        <w:rPr>
-          <w:rFonts w:hint="cs"/>
-          <w:rtl/>
-        </w:rPr>
-        <w:t>1. עובד רגיל</w:t>
-      </w:r>
-    </w:p>
-    <w:p>
-      <w:pPr>
-        <w:bidi/>
-        <w:rPr>
-          <w:rtl/>
-        </w:rPr>
-      </w:pPr>
-      <w:r>
-        <w:rPr>
-          <w:rFonts w:hint="cs"/>
-          <w:rtl/>
-        </w:rPr>
-        <w:t>2. מנהל כוח האדם</w:t>
-      </w:r>
-    </w:p>
-    <w:p>
-      <w:pPr>
-        <w:bidi/>
-        <w:rPr>
-          <w:rtl/>
-        </w:rPr>
-      </w:pPr>
-      <w:r>
-        <w:rPr>
-          <w:rFonts w:hint="cs"/>
-          <w:rtl/>
-        </w:rPr>
-        <w:t>3. יציאה מהמערכת</w:t>
-      </w:r>
-    </w:p>
-    <w:p>
-      <w:pPr>
-        <w:bidi/>
-        <w:rPr>
-          <w:rtl/>
-        </w:rPr>
-      </w:pPr>
-    </w:p>
-    <w:p>
-      <w:pPr>
-        <w:bidi/>
+      </w:pPr>
+      <w:r>
         <w:rPr>
           <w:rFonts w:asciiTheme="minorBidi" w:hAnsiTheme="minorBidi" w:cstheme="minorBidi"/>
           <w:b/>
@@ -138,10 +68,82 @@
             <w14:round/>
           </w14:textOutline>
         </w:rPr>
-      </w:pPr>
-      <w:r>
-        <w:rPr>
-          <w:rFonts w:asciiTheme="minorBidi" w:hAnsiTheme="minorBidi" w:cstheme="minorBidi" w:hint="cs"/>
+        <w:t>הוראות הפעלה:</w:t>
+      </w:r>
+    </w:p>
+    <w:p>
+      <w:pPr>
+        <w:bidi/>
+        <w:rPr>
+          <w:rtl/>
+        </w:rPr>
+      </w:pPr>
+      <w:r>
+        <w:rPr>
+          <w:rFonts w:hint="cs"/>
+          <w:rtl/>
+        </w:rPr>
+        <w:t>למשתמש יוצג תפריט בעל 3 אופציות כניסה למערכת:</w:t>
+      </w:r>
+    </w:p>
+    <w:p>
+      <w:pPr>
+        <w:bidi/>
+        <w:rPr>
+          <w:rtl/>
+        </w:rPr>
+      </w:pPr>
+      <w:r>
+        <w:rPr>
+          <w:rFonts w:hint="cs"/>
+          <w:rtl/>
+        </w:rPr>
+        <w:t>1. עובד רגיל</w:t>
+      </w:r>
+    </w:p>
+    <w:p>
+      <w:pPr>
+        <w:bidi/>
+        <w:rPr>
+          <w:rtl/>
+        </w:rPr>
+      </w:pPr>
+      <w:r>
+        <w:rPr>
+          <w:rFonts w:hint="cs"/>
+          <w:rtl/>
+        </w:rPr>
+        <w:t>2. מנהל כוח האדם</w:t>
+      </w:r>
+    </w:p>
+    <w:p>
+      <w:pPr>
+        <w:bidi/>
+        <w:rPr>
+          <w:rtl/>
+        </w:rPr>
+      </w:pPr>
+      <w:r>
+        <w:rPr>
+          <w:rFonts w:hint="cs"/>
+          <w:rtl/>
+        </w:rPr>
+        <w:t>3. יציאה מהמערכת</w:t>
+      </w:r>
+    </w:p>
+    <w:p>
+      <w:pPr>
+        <w:bidi/>
+        <w:rPr>
+          <w:rtl/>
+        </w:rPr>
+      </w:pPr>
+    </w:p>
+    <w:p>
+      <w:pPr>
+        <w:bidi/>
+        <w:rPr>
+          <w:rFonts w:asciiTheme="minorBidi" w:hAnsiTheme="minorBidi" w:cstheme="minorBidi"/>
           <w:b/>
           <w:bCs/>
           <w:sz w:val="32"/>
@@ -159,11 +161,10 @@
             <w14:round/>
           </w14:textOutline>
         </w:rPr>
-        <w:t>פונקציונליות נתמכות לעובד רגיל</w:t>
-      </w:r>
-      <w:r>
-        <w:rPr>
-          <w:rFonts w:asciiTheme="minorBidi" w:hAnsiTheme="minorBidi" w:cstheme="minorBidi"/>
+      </w:pPr>
+      <w:r>
+        <w:rPr>
+          <w:rFonts w:asciiTheme="minorBidi" w:hAnsiTheme="minorBidi" w:cstheme="minorBidi" w:hint="cs"/>
           <w:b/>
           <w:bCs/>
           <w:sz w:val="32"/>
@@ -181,104 +182,9 @@
             <w14:round/>
           </w14:textOutline>
         </w:rPr>
-        <w:t>:</w:t>
-      </w:r>
-    </w:p>
-    <w:p>
-      <w:pPr>
-        <w:bidi/>
-        <w:rPr>
-          <w:lang w:val="en-US"/>
-        </w:rPr>
-      </w:pPr>
-      <w:r>
-        <w:rPr>
-          <w:rFonts w:hint="cs"/>
-          <w:rtl/>
-        </w:rPr>
-        <w:t>1. אופציה לעדכון סיסמא</w:t>
-      </w:r>
-    </w:p>
-    <w:p>
-      <w:pPr>
-        <w:bidi/>
-        <w:rPr>
-          <w:rtl/>
-          <w:lang w:val="en-US"/>
-        </w:rPr>
-      </w:pPr>
-      <w:r>
-        <w:rPr>
-          <w:rFonts w:hint="cs"/>
-          <w:rtl/>
-          <w:lang w:val="en-US"/>
-        </w:rPr>
-        <w:t>2. הגשת משמרות</w:t>
-      </w:r>
-    </w:p>
-    <w:p>
-      <w:pPr>
-        <w:bidi/>
-        <w:rPr>
-          <w:rtl/>
-          <w:lang w:val="en-US"/>
-        </w:rPr>
-      </w:pPr>
-      <w:r>
-        <w:rPr>
-          <w:rFonts w:hint="cs"/>
-          <w:rtl/>
-          <w:lang w:val="en-US"/>
-        </w:rPr>
-        <w:t>3.</w:t>
-      </w:r>
-      <w:r>
-        <w:rPr>
-          <w:rFonts w:hint="cs"/>
-          <w:rtl/>
-          <w:lang w:val="en-US"/>
-        </w:rPr>
-        <w:t xml:space="preserve"> צפייה במשמרות שהוגשו</w:t>
-      </w:r>
-    </w:p>
-    <w:p>
-      <w:pPr>
-        <w:bidi/>
-        <w:rPr>
-          <w:rtl/>
-          <w:lang w:val="en-US"/>
-        </w:rPr>
-      </w:pPr>
-      <w:r>
-        <w:rPr>
-          <w:rFonts w:hint="cs"/>
-          <w:rtl/>
-          <w:lang w:val="en-US"/>
-        </w:rPr>
-        <w:t>4. שינוי המשמרות</w:t>
-      </w:r>
-    </w:p>
-    <w:p>
-      <w:pPr>
-        <w:bidi/>
-        <w:rPr>
-          <w:rFonts w:hint="cs"/>
-          <w:rtl/>
-          <w:lang w:val="en-US"/>
-        </w:rPr>
-      </w:pPr>
-      <w:r>
-        <w:rPr>
-          <w:rFonts w:hint="cs"/>
-          <w:rtl/>
-          <w:lang w:val="en-US"/>
-        </w:rPr>
-        <w:t>5. יציאה מהמערכת</w:t>
-      </w:r>
-    </w:p>
-    <w:p>
-      <w:pPr>
-        <w:bidi/>
+        <w:t>הרשאות גישה וסיסמאות</w:t>
+      </w:r>
+      <w:r>
         <w:rPr>
           <w:rFonts w:asciiTheme="minorBidi" w:hAnsiTheme="minorBidi" w:cstheme="minorBidi"/>
           <w:b/>
@@ -298,6 +204,512 @@
             <w14:round/>
           </w14:textOutline>
         </w:rPr>
+        <w:t>:</w:t>
+      </w:r>
+    </w:p>
+    <w:p>
+      <w:pPr>
+        <w:bidi/>
+        <w:rPr>
+          <w:rtl/>
+          <w:lang w:val="en-US"/>
+        </w:rPr>
+      </w:pPr>
+      <w:r>
+        <w:rPr>
+          <w:rFonts w:hint="cs"/>
+          <w:rtl/>
+        </w:rPr>
+        <w:t xml:space="preserve">בעת כניסה למערכת, המערכת טוענת </w:t>
+      </w:r>
+      <w:r>
+        <w:rPr>
+          <w:lang w:val="en-US"/>
+        </w:rPr>
+        <w:t>Data Base</w:t>
+      </w:r>
+      <w:r>
+        <w:rPr>
+          <w:rFonts w:hint="cs"/>
+          <w:rtl/>
+          <w:lang w:val="en-US"/>
+        </w:rPr>
+        <w:t xml:space="preserve"> ראשוני של עובדים</w:t>
+      </w:r>
+      <w:r>
+        <w:rPr>
+          <w:lang w:val="en-US"/>
+        </w:rPr>
+        <w:t>:</w:t>
+      </w:r>
+      <w:r>
+        <w:rPr>
+          <w:rtl/>
+          <w:lang w:val="en-US"/>
+        </w:rPr>
+        <w:br/>
+      </w:r>
+    </w:p>
+    <w:tbl>
+      <w:tblPr>
+        <w:tblStyle w:val="TableGrid"/>
+        <w:bidiVisual/>
+        <w:tblW w:w="0" w:type="auto"/>
+        <w:tblLook w:val="04A0" w:firstRow="1" w:lastRow="0" w:firstColumn="1" w:lastColumn="0" w:noHBand="0" w:noVBand="1"/>
+      </w:tblPr>
+      <w:tblGrid>
+        <w:gridCol w:w="1770"/>
+        <w:gridCol w:w="1501"/>
+        <w:gridCol w:w="1644"/>
+        <w:gridCol w:w="1845"/>
+        <w:gridCol w:w="2590"/>
+      </w:tblGrid>
+      <w:tr>
+        <w:tc>
+          <w:tcPr>
+            <w:tcW w:w="1870" w:type="dxa"/>
+          </w:tcPr>
+          <w:p>
+            <w:pPr>
+              <w:bidi/>
+              <w:jc w:val="center"/>
+              <w:rPr>
+                <w:rFonts w:hint="cs"/>
+                <w:b/>
+                <w:bCs/>
+                <w:sz w:val="28"/>
+                <w:szCs w:val="28"/>
+                <w:rtl/>
+                <w:lang w:val="en-US"/>
+              </w:rPr>
+            </w:pPr>
+            <w:r>
+              <w:rPr>
+                <w:rFonts w:hint="cs"/>
+                <w:b/>
+                <w:bCs/>
+                <w:sz w:val="28"/>
+                <w:szCs w:val="28"/>
+                <w:rtl/>
+                <w:lang w:val="en-US"/>
+              </w:rPr>
+              <w:t>תפקיד</w:t>
+            </w:r>
+          </w:p>
+        </w:tc>
+        <w:tc>
+          <w:tcPr>
+            <w:tcW w:w="1870" w:type="dxa"/>
+          </w:tcPr>
+          <w:p>
+            <w:pPr>
+              <w:bidi/>
+              <w:jc w:val="center"/>
+              <w:rPr>
+                <w:rFonts w:hint="cs"/>
+                <w:b/>
+                <w:bCs/>
+                <w:sz w:val="28"/>
+                <w:szCs w:val="28"/>
+                <w:rtl/>
+                <w:lang w:val="en-US"/>
+              </w:rPr>
+            </w:pPr>
+            <w:r>
+              <w:rPr>
+                <w:b/>
+                <w:bCs/>
+                <w:sz w:val="28"/>
+                <w:szCs w:val="28"/>
+                <w:lang w:val="en-US"/>
+              </w:rPr>
+              <w:t>HR</w:t>
+            </w:r>
+          </w:p>
+        </w:tc>
+        <w:tc>
+          <w:tcPr>
+            <w:tcW w:w="1870" w:type="dxa"/>
+          </w:tcPr>
+          <w:p>
+            <w:pPr>
+              <w:bidi/>
+              <w:jc w:val="center"/>
+              <w:rPr>
+                <w:rFonts w:hint="cs"/>
+                <w:b/>
+                <w:bCs/>
+                <w:sz w:val="28"/>
+                <w:szCs w:val="28"/>
+                <w:rtl/>
+                <w:lang w:val="en-US"/>
+              </w:rPr>
+            </w:pPr>
+            <w:r>
+              <w:rPr>
+                <w:b/>
+                <w:bCs/>
+                <w:sz w:val="28"/>
+                <w:szCs w:val="28"/>
+                <w:lang w:val="en-US"/>
+              </w:rPr>
+              <w:t>Cashier</w:t>
+            </w:r>
+          </w:p>
+        </w:tc>
+        <w:tc>
+          <w:tcPr>
+            <w:tcW w:w="1870" w:type="dxa"/>
+          </w:tcPr>
+          <w:p>
+            <w:pPr>
+              <w:jc w:val="center"/>
+              <w:rPr>
+                <w:b/>
+                <w:bCs/>
+                <w:sz w:val="28"/>
+                <w:szCs w:val="28"/>
+                <w:lang w:val="en-US"/>
+              </w:rPr>
+            </w:pPr>
+            <w:r>
+              <w:rPr>
+                <w:b/>
+                <w:bCs/>
+                <w:sz w:val="28"/>
+                <w:szCs w:val="28"/>
+                <w:lang w:val="en-US"/>
+              </w:rPr>
+              <w:t>storekeeper</w:t>
+            </w:r>
+          </w:p>
+        </w:tc>
+        <w:tc>
+          <w:tcPr>
+            <w:tcW w:w="1870" w:type="dxa"/>
+          </w:tcPr>
+          <w:p>
+            <w:pPr>
+              <w:bidi/>
+              <w:jc w:val="center"/>
+              <w:rPr>
+                <w:rFonts w:hint="cs"/>
+                <w:b/>
+                <w:bCs/>
+                <w:sz w:val="28"/>
+                <w:szCs w:val="28"/>
+                <w:rtl/>
+                <w:lang w:val="en-US"/>
+              </w:rPr>
+            </w:pPr>
+            <w:r>
+              <w:rPr>
+                <w:b/>
+                <w:bCs/>
+                <w:sz w:val="28"/>
+                <w:szCs w:val="28"/>
+                <w:lang w:val="en-US"/>
+              </w:rPr>
+              <w:t xml:space="preserve">Cashier+ </w:t>
+            </w:r>
+            <w:proofErr w:type="spellStart"/>
+            <w:r>
+              <w:rPr>
+                <w:b/>
+                <w:bCs/>
+                <w:sz w:val="28"/>
+                <w:szCs w:val="28"/>
+                <w:lang w:val="en-US"/>
+              </w:rPr>
+              <w:t>storekeeper</w:t>
+            </w:r>
+            <w:r>
+              <w:rPr>
+                <w:b/>
+                <w:bCs/>
+                <w:sz w:val="28"/>
+                <w:szCs w:val="28"/>
+                <w:lang w:val="en-US"/>
+              </w:rPr>
+              <w:t>+Shift</w:t>
+            </w:r>
+            <w:proofErr w:type="spellEnd"/>
+            <w:r>
+              <w:rPr>
+                <w:b/>
+                <w:bCs/>
+                <w:sz w:val="28"/>
+                <w:szCs w:val="28"/>
+                <w:lang w:val="en-US"/>
+              </w:rPr>
+              <w:t xml:space="preserve"> Manager</w:t>
+            </w:r>
+          </w:p>
+        </w:tc>
+      </w:tr>
+      <w:tr>
+        <w:trPr>
+          <w:trHeight w:val="612"/>
+        </w:trPr>
+        <w:tc>
+          <w:tcPr>
+            <w:tcW w:w="1870" w:type="dxa"/>
+          </w:tcPr>
+          <w:p>
+            <w:pPr>
+              <w:jc w:val="center"/>
+              <w:rPr>
+                <w:b/>
+                <w:bCs/>
+                <w:lang w:val="en-US"/>
+              </w:rPr>
+            </w:pPr>
+            <w:proofErr w:type="gramStart"/>
+            <w:r>
+              <w:rPr>
+                <w:b/>
+                <w:bCs/>
+                <w:lang w:val="en-US"/>
+              </w:rPr>
+              <w:t>USER NAME</w:t>
+            </w:r>
+            <w:proofErr w:type="gramEnd"/>
+          </w:p>
+        </w:tc>
+        <w:tc>
+          <w:tcPr>
+            <w:tcW w:w="1870" w:type="dxa"/>
+          </w:tcPr>
+          <w:p>
+            <w:pPr>
+              <w:tabs>
+                <w:tab w:val="left" w:pos="341"/>
+              </w:tabs>
+              <w:bidi/>
+              <w:jc w:val="center"/>
+              <w:rPr>
+                <w:lang w:val="en-US"/>
+              </w:rPr>
+            </w:pPr>
+            <w:r>
+              <w:rPr>
+                <w:lang w:val="en-US"/>
+              </w:rPr>
+              <w:t>“hr1”</w:t>
+            </w:r>
+          </w:p>
+        </w:tc>
+        <w:tc>
+          <w:tcPr>
+            <w:tcW w:w="1870" w:type="dxa"/>
+          </w:tcPr>
+          <w:p>
+            <w:pPr>
+              <w:bidi/>
+              <w:jc w:val="center"/>
+              <w:rPr>
+                <w:rFonts w:hint="cs"/>
+                <w:rtl/>
+                <w:lang w:val="en-US"/>
+              </w:rPr>
+            </w:pPr>
+            <w:r>
+              <w:rPr>
+                <w:lang w:val="en-US"/>
+              </w:rPr>
+              <w:t>“cashier1”</w:t>
+            </w:r>
+          </w:p>
+        </w:tc>
+        <w:tc>
+          <w:tcPr>
+            <w:tcW w:w="1870" w:type="dxa"/>
+          </w:tcPr>
+          <w:p>
+            <w:pPr>
+              <w:bidi/>
+              <w:jc w:val="center"/>
+              <w:rPr>
+                <w:rFonts w:hint="cs"/>
+                <w:rtl/>
+                <w:lang w:val="en-US"/>
+              </w:rPr>
+            </w:pPr>
+            <w:r>
+              <w:rPr>
+                <w:lang w:val="en-US"/>
+              </w:rPr>
+              <w:t>“store1”</w:t>
+            </w:r>
+          </w:p>
+        </w:tc>
+        <w:tc>
+          <w:tcPr>
+            <w:tcW w:w="1870" w:type="dxa"/>
+          </w:tcPr>
+          <w:p>
+            <w:pPr>
+              <w:bidi/>
+              <w:jc w:val="center"/>
+              <w:rPr>
+                <w:rFonts w:hint="cs"/>
+                <w:rtl/>
+                <w:lang w:val="en-US"/>
+              </w:rPr>
+            </w:pPr>
+            <w:r>
+              <w:rPr>
+                <w:lang w:val="en-US"/>
+              </w:rPr>
+              <w:t>“multi1”</w:t>
+            </w:r>
+          </w:p>
+        </w:tc>
+      </w:tr>
+      <w:tr>
+        <w:trPr>
+          <w:trHeight w:val="631"/>
+        </w:trPr>
+        <w:tc>
+          <w:tcPr>
+            <w:tcW w:w="1870" w:type="dxa"/>
+          </w:tcPr>
+          <w:p>
+            <w:pPr>
+              <w:bidi/>
+              <w:jc w:val="center"/>
+              <w:rPr>
+                <w:rFonts w:hint="cs"/>
+                <w:b/>
+                <w:bCs/>
+                <w:rtl/>
+                <w:lang w:val="en-US"/>
+              </w:rPr>
+            </w:pPr>
+            <w:r>
+              <w:rPr>
+                <w:b/>
+                <w:bCs/>
+                <w:lang w:val="en-US"/>
+              </w:rPr>
+              <w:t>PASSWORD</w:t>
+            </w:r>
+          </w:p>
+        </w:tc>
+        <w:tc>
+          <w:tcPr>
+            <w:tcW w:w="1870" w:type="dxa"/>
+          </w:tcPr>
+          <w:p>
+            <w:pPr>
+              <w:bidi/>
+              <w:jc w:val="center"/>
+              <w:rPr>
+                <w:rFonts w:hint="cs"/>
+                <w:rtl/>
+                <w:lang w:val="en-US"/>
+              </w:rPr>
+            </w:pPr>
+            <w:r>
+              <w:rPr>
+                <w:lang w:val="en-US"/>
+              </w:rPr>
+              <w:t>“1234”</w:t>
+            </w:r>
+          </w:p>
+        </w:tc>
+        <w:tc>
+          <w:tcPr>
+            <w:tcW w:w="1870" w:type="dxa"/>
+          </w:tcPr>
+          <w:p>
+            <w:pPr>
+              <w:bidi/>
+              <w:jc w:val="center"/>
+              <w:rPr>
+                <w:rFonts w:hint="cs"/>
+                <w:rtl/>
+                <w:lang w:val="en-US"/>
+              </w:rPr>
+            </w:pPr>
+            <w:r>
+              <w:rPr>
+                <w:lang w:val="en-US"/>
+              </w:rPr>
+              <w:t>“1234”</w:t>
+            </w:r>
+          </w:p>
+        </w:tc>
+        <w:tc>
+          <w:tcPr>
+            <w:tcW w:w="1870" w:type="dxa"/>
+          </w:tcPr>
+          <w:p>
+            <w:pPr>
+              <w:bidi/>
+              <w:jc w:val="center"/>
+              <w:rPr>
+                <w:rFonts w:hint="cs"/>
+                <w:rtl/>
+                <w:lang w:val="en-US"/>
+              </w:rPr>
+            </w:pPr>
+            <w:r>
+              <w:rPr>
+                <w:lang w:val="en-US"/>
+              </w:rPr>
+              <w:t>“1234”</w:t>
+            </w:r>
+          </w:p>
+        </w:tc>
+        <w:tc>
+          <w:tcPr>
+            <w:tcW w:w="1870" w:type="dxa"/>
+          </w:tcPr>
+          <w:p>
+            <w:pPr>
+              <w:bidi/>
+              <w:jc w:val="center"/>
+              <w:rPr>
+                <w:rFonts w:hint="cs"/>
+                <w:rtl/>
+                <w:lang w:val="en-US"/>
+              </w:rPr>
+            </w:pPr>
+            <w:r>
+              <w:rPr>
+                <w:lang w:val="en-US"/>
+              </w:rPr>
+              <w:t>“1234”</w:t>
+            </w:r>
+          </w:p>
+        </w:tc>
+      </w:tr>
+    </w:tbl>
+    <w:p>
+      <w:pPr>
+        <w:bidi/>
+        <w:rPr>
+          <w:rFonts w:hint="cs"/>
+          <w:rtl/>
+          <w:lang w:val="en-US"/>
+        </w:rPr>
+      </w:pPr>
+    </w:p>
+    <w:p>
+      <w:pPr>
+        <w:bidi/>
+        <w:rPr>
+          <w:rtl/>
+        </w:rPr>
+      </w:pPr>
+    </w:p>
+    <w:p>
+      <w:pPr>
+        <w:bidi/>
+        <w:rPr>
+          <w:rtl/>
+        </w:rPr>
       </w:pPr>
     </w:p>
     <w:p>
@@ -371,7 +783,512 @@
     <w:p>
       <w:pPr>
         <w:bidi/>
-      </w:pPr>
+        <w:rPr>
+          <w:lang w:val="en-US"/>
+        </w:rPr>
+      </w:pPr>
+      <w:r>
+        <w:rPr>
+          <w:rFonts w:hint="cs"/>
+          <w:rtl/>
+        </w:rPr>
+        <w:t>1. אופציה לעדכון סיסמא</w:t>
+      </w:r>
+    </w:p>
+    <w:p>
+      <w:pPr>
+        <w:bidi/>
+        <w:rPr>
+          <w:rtl/>
+          <w:lang w:val="en-US"/>
+        </w:rPr>
+      </w:pPr>
+      <w:r>
+        <w:rPr>
+          <w:rFonts w:hint="cs"/>
+          <w:rtl/>
+          <w:lang w:val="en-US"/>
+        </w:rPr>
+        <w:t>2. הגשת משמרות</w:t>
+      </w:r>
+    </w:p>
+    <w:p>
+      <w:pPr>
+        <w:bidi/>
+        <w:rPr>
+          <w:rtl/>
+          <w:lang w:val="en-US"/>
+        </w:rPr>
+      </w:pPr>
+      <w:r>
+        <w:rPr>
+          <w:rFonts w:hint="cs"/>
+          <w:rtl/>
+          <w:lang w:val="en-US"/>
+        </w:rPr>
+        <w:t>3.</w:t>
+      </w:r>
+      <w:r>
+        <w:rPr>
+          <w:rFonts w:hint="cs"/>
+          <w:rtl/>
+          <w:lang w:val="en-US"/>
+        </w:rPr>
+        <w:t xml:space="preserve"> צפייה במשמרות שהוגשו</w:t>
+      </w:r>
+    </w:p>
+    <w:p>
+      <w:pPr>
+        <w:bidi/>
+        <w:rPr>
+          <w:rtl/>
+          <w:lang w:val="en-US"/>
+        </w:rPr>
+      </w:pPr>
+      <w:r>
+        <w:rPr>
+          <w:rFonts w:hint="cs"/>
+          <w:rtl/>
+          <w:lang w:val="en-US"/>
+        </w:rPr>
+        <w:t>4. שינוי המשמרות</w:t>
+      </w:r>
+    </w:p>
+    <w:p>
+      <w:pPr>
+        <w:bidi/>
+        <w:rPr>
+          <w:rFonts w:hint="cs"/>
+          <w:rtl/>
+          <w:lang w:val="en-US"/>
+        </w:rPr>
+      </w:pPr>
+      <w:r>
+        <w:rPr>
+          <w:rFonts w:hint="cs"/>
+          <w:rtl/>
+          <w:lang w:val="en-US"/>
+        </w:rPr>
+        <w:t>5. יציאה מהמערכת</w:t>
+      </w:r>
+    </w:p>
+    <w:p>
+      <w:pPr>
+        <w:bidi/>
+        <w:rPr>
+          <w:rFonts w:asciiTheme="minorBidi" w:hAnsiTheme="minorBidi" w:cstheme="minorBidi"/>
+          <w:b/>
+          <w:bCs/>
+          <w:sz w:val="32"/>
+          <w:szCs w:val="32"/>
+          <w:u w:val="single"/>
+          <w:rtl/>
+          <w14:shadow w14:blurRad="38100" w14:dist="19050" w14:dir="2700000" w14:sx="100000" w14:sy="100000" w14:kx="0" w14:ky="0" w14:algn="tl">
+            <w14:schemeClr w14:val="dk1">
+              <w14:alpha w14:val="60000"/>
+            </w14:schemeClr>
+          </w14:shadow>
+          <w14:textOutline w14:w="0" w14:cap="flat" w14:cmpd="sng" w14:algn="ctr">
+            <w14:noFill/>
+            <w14:prstDash w14:val="solid"/>
+            <w14:round/>
+          </w14:textOutline>
+        </w:rPr>
+      </w:pPr>
+    </w:p>
+    <w:p>
+      <w:pPr>
+        <w:bidi/>
+        <w:rPr>
+          <w:rFonts w:asciiTheme="minorBidi" w:hAnsiTheme="minorBidi" w:cstheme="minorBidi"/>
+          <w:b/>
+          <w:bCs/>
+          <w:sz w:val="32"/>
+          <w:szCs w:val="32"/>
+          <w:u w:val="single"/>
+          <w:rtl/>
+          <w14:shadow w14:blurRad="38100" w14:dist="19050" w14:dir="2700000" w14:sx="100000" w14:sy="100000" w14:kx="0" w14:ky="0" w14:algn="tl">
+            <w14:schemeClr w14:val="dk1">
+              <w14:alpha w14:val="60000"/>
+            </w14:schemeClr>
+          </w14:shadow>
+          <w14:textOutline w14:w="0" w14:cap="flat" w14:cmpd="sng" w14:algn="ctr">
+            <w14:noFill/>
+            <w14:prstDash w14:val="solid"/>
+            <w14:round/>
+          </w14:textOutline>
+        </w:rPr>
+      </w:pPr>
+      <w:r>
+        <w:rPr>
+          <w:rFonts w:asciiTheme="minorBidi" w:hAnsiTheme="minorBidi" w:cstheme="minorBidi" w:hint="cs"/>
+          <w:b/>
+          <w:bCs/>
+          <w:sz w:val="32"/>
+          <w:szCs w:val="32"/>
+          <w:u w:val="single"/>
+          <w:rtl/>
+          <w14:shadow w14:blurRad="38100" w14:dist="19050" w14:dir="2700000" w14:sx="100000" w14:sy="100000" w14:kx="0" w14:ky="0" w14:algn="tl">
+            <w14:schemeClr w14:val="dk1">
+              <w14:alpha w14:val="60000"/>
+            </w14:schemeClr>
+          </w14:shadow>
+          <w14:textOutline w14:w="0" w14:cap="flat" w14:cmpd="sng" w14:algn="ctr">
+            <w14:noFill/>
+            <w14:prstDash w14:val="solid"/>
+            <w14:round/>
+          </w14:textOutline>
+        </w:rPr>
+        <w:lastRenderedPageBreak/>
+        <w:t>פונקציונליות נתמכות ל</w:t>
+      </w:r>
+      <w:r>
+        <w:rPr>
+          <w:rFonts w:asciiTheme="minorBidi" w:hAnsiTheme="minorBidi" w:cstheme="minorBidi" w:hint="cs"/>
+          <w:b/>
+          <w:bCs/>
+          <w:sz w:val="32"/>
+          <w:szCs w:val="32"/>
+          <w:u w:val="single"/>
+          <w:rtl/>
+          <w14:shadow w14:blurRad="38100" w14:dist="19050" w14:dir="2700000" w14:sx="100000" w14:sy="100000" w14:kx="0" w14:ky="0" w14:algn="tl">
+            <w14:schemeClr w14:val="dk1">
+              <w14:alpha w14:val="60000"/>
+            </w14:schemeClr>
+          </w14:shadow>
+          <w14:textOutline w14:w="0" w14:cap="flat" w14:cmpd="sng" w14:algn="ctr">
+            <w14:noFill/>
+            <w14:prstDash w14:val="solid"/>
+            <w14:round/>
+          </w14:textOutline>
+        </w:rPr>
+        <w:t>מנהל כוח אדם</w:t>
+      </w:r>
+      <w:r>
+        <w:rPr>
+          <w:rFonts w:asciiTheme="minorBidi" w:hAnsiTheme="minorBidi" w:cstheme="minorBidi"/>
+          <w:b/>
+          <w:bCs/>
+          <w:sz w:val="32"/>
+          <w:szCs w:val="32"/>
+          <w:u w:val="single"/>
+          <w:rtl/>
+          <w14:shadow w14:blurRad="38100" w14:dist="19050" w14:dir="2700000" w14:sx="100000" w14:sy="100000" w14:kx="0" w14:ky="0" w14:algn="tl">
+            <w14:schemeClr w14:val="dk1">
+              <w14:alpha w14:val="60000"/>
+            </w14:schemeClr>
+          </w14:shadow>
+          <w14:textOutline w14:w="0" w14:cap="flat" w14:cmpd="sng" w14:algn="ctr">
+            <w14:noFill/>
+            <w14:prstDash w14:val="solid"/>
+            <w14:round/>
+          </w14:textOutline>
+        </w:rPr>
+        <w:t>:</w:t>
+      </w:r>
+    </w:p>
+    <w:p>
+      <w:pPr>
+        <w:bidi/>
+        <w:rPr>
+          <w:rFonts w:hint="cs"/>
+          <w:rtl/>
+          <w:lang w:val="en-US"/>
+        </w:rPr>
+      </w:pPr>
+      <w:r>
+        <w:rPr>
+          <w:rFonts w:hint="cs"/>
+          <w:rtl/>
+          <w:lang w:val="en-US"/>
+        </w:rPr>
+        <w:t>1. צפייה במספרי סניף</w:t>
+      </w:r>
+      <w:r>
+        <w:rPr>
+          <w:rtl/>
+          <w:lang w:val="en-US"/>
+        </w:rPr>
+        <w:br/>
+      </w:r>
+      <w:r>
+        <w:rPr>
+          <w:rFonts w:hint="cs"/>
+          <w:rtl/>
+          <w:lang w:val="en-US"/>
+        </w:rPr>
+        <w:t>2. הוספת סניף</w:t>
+      </w:r>
+      <w:r>
+        <w:rPr>
+          <w:rtl/>
+          <w:lang w:val="en-US"/>
+        </w:rPr>
+        <w:br/>
+      </w:r>
+      <w:r>
+        <w:rPr>
+          <w:rFonts w:hint="cs"/>
+          <w:rtl/>
+          <w:lang w:val="en-US"/>
+        </w:rPr>
+        <w:t>3. הסרת סניף</w:t>
+      </w:r>
+      <w:r>
+        <w:rPr>
+          <w:rtl/>
+          <w:lang w:val="en-US"/>
+        </w:rPr>
+        <w:br/>
+      </w:r>
+      <w:r>
+        <w:rPr>
+          <w:rFonts w:hint="cs"/>
+          <w:rtl/>
+          <w:lang w:val="en-US"/>
+        </w:rPr>
+        <w:t>4. יצירת תפקיד חדש</w:t>
+      </w:r>
+      <w:r>
+        <w:rPr>
+          <w:rtl/>
+          <w:lang w:val="en-US"/>
+        </w:rPr>
+        <w:br/>
+      </w:r>
+      <w:r>
+        <w:rPr>
+          <w:rFonts w:hint="cs"/>
+          <w:rtl/>
+          <w:lang w:val="en-US"/>
+        </w:rPr>
+        <w:t>5.הוספת תפקיד לעובד</w:t>
+      </w:r>
+      <w:r>
+        <w:rPr>
+          <w:rtl/>
+          <w:lang w:val="en-US"/>
+        </w:rPr>
+        <w:br/>
+      </w:r>
+      <w:r>
+        <w:rPr>
+          <w:rFonts w:hint="cs"/>
+          <w:rtl/>
+          <w:lang w:val="en-US"/>
+        </w:rPr>
+        <w:t>6. גיוס עובד</w:t>
+      </w:r>
+      <w:r>
+        <w:rPr>
+          <w:rtl/>
+          <w:lang w:val="en-US"/>
+        </w:rPr>
+        <w:br/>
+      </w:r>
+      <w:r>
+        <w:rPr>
+          <w:rFonts w:hint="cs"/>
+          <w:rtl/>
+          <w:lang w:val="en-US"/>
+        </w:rPr>
+        <w:t>7. פיטור עובד</w:t>
+      </w:r>
+      <w:r>
+        <w:rPr>
+          <w:rtl/>
+          <w:lang w:val="en-US"/>
+        </w:rPr>
+        <w:br/>
+      </w:r>
+      <w:r>
+        <w:rPr>
+          <w:rFonts w:hint="cs"/>
+          <w:rtl/>
+          <w:lang w:val="en-US"/>
+        </w:rPr>
+        <w:t>8. שינוי משכורת שעתית לעובד</w:t>
+      </w:r>
+      <w:r>
+        <w:rPr>
+          <w:rtl/>
+          <w:lang w:val="en-US"/>
+        </w:rPr>
+        <w:br/>
+      </w:r>
+      <w:r>
+        <w:rPr>
+          <w:rFonts w:hint="cs"/>
+          <w:rtl/>
+          <w:lang w:val="en-US"/>
+        </w:rPr>
+        <w:t>9. צפייה בכל העובדים ותפקידם</w:t>
+      </w:r>
+      <w:r>
+        <w:rPr>
+          <w:rtl/>
+          <w:lang w:val="en-US"/>
+        </w:rPr>
+        <w:br/>
+      </w:r>
+      <w:r>
+        <w:rPr>
+          <w:rFonts w:hint="cs"/>
+          <w:rtl/>
+          <w:lang w:val="en-US"/>
+        </w:rPr>
+        <w:t>10. צפייה בכל התפקידם הנוכחיים</w:t>
+      </w:r>
+      <w:r>
+        <w:rPr>
+          <w:rtl/>
+          <w:lang w:val="en-US"/>
+        </w:rPr>
+        <w:br/>
+      </w:r>
+      <w:r>
+        <w:rPr>
+          <w:rFonts w:hint="cs"/>
+          <w:rtl/>
+          <w:lang w:val="en-US"/>
+        </w:rPr>
+        <w:t>11. פרסום משמרות לשבוע הבא</w:t>
+      </w:r>
+      <w:r>
+        <w:rPr>
+          <w:rtl/>
+          <w:lang w:val="en-US"/>
+        </w:rPr>
+        <w:br/>
+      </w:r>
+      <w:r>
+        <w:rPr>
+          <w:rFonts w:hint="cs"/>
+          <w:rtl/>
+          <w:lang w:val="en-US"/>
+        </w:rPr>
+        <w:t>12. הגדרת משמרת כשבוע הנוכחי</w:t>
+      </w:r>
+      <w:r>
+        <w:rPr>
+          <w:rtl/>
+          <w:lang w:val="en-US"/>
+        </w:rPr>
+        <w:br/>
+      </w:r>
+      <w:r>
+        <w:rPr>
+          <w:rFonts w:hint="cs"/>
+          <w:rtl/>
+          <w:lang w:val="en-US"/>
+        </w:rPr>
+        <w:t>13. שינוי דרישות משמרת</w:t>
+      </w:r>
+      <w:r>
+        <w:rPr>
+          <w:rtl/>
+          <w:lang w:val="en-US"/>
+        </w:rPr>
+        <w:br/>
+      </w:r>
+      <w:r>
+        <w:rPr>
+          <w:rFonts w:hint="cs"/>
+          <w:rtl/>
+          <w:lang w:val="en-US"/>
+        </w:rPr>
+        <w:t>14. הצגת עובדים זמינים למשמרת ע״פ תפקיד</w:t>
+      </w:r>
+      <w:r>
+        <w:rPr>
+          <w:rtl/>
+          <w:lang w:val="en-US"/>
+        </w:rPr>
+        <w:br/>
+      </w:r>
+      <w:r>
+        <w:rPr>
+          <w:rFonts w:hint="cs"/>
+          <w:rtl/>
+          <w:lang w:val="en-US"/>
+        </w:rPr>
+        <w:t>15. שיבוץ עובד</w:t>
+      </w:r>
+      <w:r>
+        <w:rPr>
+          <w:rtl/>
+          <w:lang w:val="en-US"/>
+        </w:rPr>
+        <w:br/>
+      </w:r>
+      <w:r>
+        <w:rPr>
+          <w:rFonts w:hint="cs"/>
+          <w:rtl/>
+          <w:lang w:val="en-US"/>
+        </w:rPr>
+        <w:t>16. צפייה במשמרות השבועיות</w:t>
+      </w:r>
+      <w:r>
+        <w:rPr>
+          <w:rtl/>
+          <w:lang w:val="en-US"/>
+        </w:rPr>
+        <w:br/>
+      </w:r>
+      <w:r>
+        <w:rPr>
+          <w:rFonts w:hint="cs"/>
+          <w:rtl/>
+          <w:lang w:val="en-US"/>
+        </w:rPr>
+        <w:t>17. צפייה במשמרות של שבוע הבא</w:t>
+      </w:r>
+      <w:r>
+        <w:rPr>
+          <w:rtl/>
+          <w:lang w:val="en-US"/>
+        </w:rPr>
+        <w:br/>
+      </w:r>
+      <w:r>
+        <w:rPr>
+          <w:rFonts w:hint="cs"/>
+          <w:rtl/>
+          <w:lang w:val="en-US"/>
+        </w:rPr>
+        <w:t>18.צפייה בהיסטורית המשמרות</w:t>
+      </w:r>
+      <w:r>
+        <w:rPr>
+          <w:rtl/>
+          <w:lang w:val="en-US"/>
+        </w:rPr>
+        <w:br/>
+      </w:r>
+      <w:r>
+        <w:rPr>
+          <w:rFonts w:hint="cs"/>
+          <w:rtl/>
+          <w:lang w:val="en-US"/>
+        </w:rPr>
+        <w:t>19. צפייה בהיסטורית המשמרות ע״פ סניף</w:t>
+      </w:r>
+      <w:r>
+        <w:rPr>
+          <w:rtl/>
+          <w:lang w:val="en-US"/>
+        </w:rPr>
+        <w:br/>
+      </w:r>
+      <w:r>
+        <w:rPr>
+          <w:rFonts w:hint="cs"/>
+          <w:rtl/>
+          <w:lang w:val="en-US"/>
+        </w:rPr>
+        <w:t>20. צפייה בדרישות למשמרת (נוכחית/שבוע הבא)</w:t>
+      </w:r>
     </w:p>
     <w:sectPr>
       <w:headerReference w:type="default" r:id="rId7"/>
@@ -477,6 +1394,9 @@
         </w14:textFill>
       </w:rPr>
     </w:pPr>
+    <w:r>
+      <w:tab/>
+    </w:r>
     <w:r>
       <w:rPr>
         <w:rFonts w:hint="cs"/>
@@ -597,6 +1517,11 @@
   <w:p>
     <w:pPr>
       <w:pStyle w:val="Header"/>
+      <w:tabs>
+        <w:tab w:val="clear" w:pos="4680"/>
+        <w:tab w:val="clear" w:pos="9360"/>
+        <w:tab w:val="left" w:pos="3117"/>
+      </w:tabs>
     </w:pPr>
   </w:p>
 </w:hdr>
@@ -1811,6 +2736,25 @@
       <w:spacing w:after="0" w:line="240" w:lineRule="auto"/>
     </w:pPr>
   </w:style>
+  <w:style w:type="table" w:styleId="TableGrid">
+    <w:name w:val="Table Grid"/>
+    <w:basedOn w:val="TableNormal"/>
+    <w:uiPriority w:val="39"/>
+    <w:rsid w:val="00C37735"/>
+    <w:pPr>
+      <w:spacing w:after="0" w:line="240" w:lineRule="auto"/>
+    </w:pPr>
+    <w:tblPr>
+      <w:tblBorders>
+        <w:top w:val="single" w:sz="4" w:space="0" w:color="auto"/>
+        <w:left w:val="single" w:sz="4" w:space="0" w:color="auto"/>
+        <w:bottom w:val="single" w:sz="4" w:space="0" w:color="auto"/>
+        <w:right w:val="single" w:sz="4" w:space="0" w:color="auto"/>
+        <w:insideH w:val="single" w:sz="4" w:space="0" w:color="auto"/>
+        <w:insideV w:val="single" w:sz="4" w:space="0" w:color="auto"/>
+      </w:tblBorders>
+    </w:tblPr>
+  </w:style>
 </w:styles>
 </file>
 

</xml_diff>

<commit_message>
Editing last changes for the HR menu
</commit_message>
<xml_diff>
--- a/docs/הוראות הפעלה למערכת.docx
+++ b/docs/הוראות הפעלה למערכת.docx
@@ -858,8 +858,6 @@
       <w:pPr>
         <w:bidi/>
         <w:rPr>
-          <w:rFonts w:hint="cs"/>
-          <w:rtl/>
           <w:lang w:val="en-US"/>
         </w:rPr>
       </w:pPr>
@@ -991,8 +989,6 @@
       <w:pPr>
         <w:bidi/>
         <w:rPr>
-          <w:rFonts w:hint="cs"/>
-          <w:rtl/>
           <w:lang w:val="en-US"/>
         </w:rPr>
       </w:pPr>
@@ -1152,7 +1148,46 @@
           <w:rtl/>
           <w:lang w:val="en-US"/>
         </w:rPr>
-        <w:t>11. פרסום משמרות לשבוע הבא</w:t>
+        <w:t xml:space="preserve">11. פרסום </w:t>
+      </w:r>
+      <w:r>
+        <w:rPr>
+          <w:rFonts w:hint="cs"/>
+          <w:rtl/>
+          <w:lang w:val="en-US"/>
+        </w:rPr>
+        <w:t>דרישות ל</w:t>
+      </w:r>
+      <w:r>
+        <w:rPr>
+          <w:rFonts w:hint="cs"/>
+          <w:rtl/>
+          <w:lang w:val="en-US"/>
+        </w:rPr>
+        <w:t xml:space="preserve">משמרות </w:t>
+      </w:r>
+      <w:r>
+        <w:rPr>
+          <w:rFonts w:hint="cs"/>
+          <w:rtl/>
+          <w:lang w:val="en-US"/>
+        </w:rPr>
+        <w:t>ב</w:t>
+      </w:r>
+      <w:r>
+        <w:rPr>
+          <w:rFonts w:hint="cs"/>
+          <w:rtl/>
+          <w:lang w:val="en-US"/>
+        </w:rPr>
+        <w:t>שבוע הבא</w:t>
+      </w:r>
+      <w:r>
+        <w:rPr>
+          <w:rtl/>
+          <w:lang w:val="en-US"/>
+        </w:rPr>
+        <w:t xml:space="preserve"> </w:t>
       </w:r>
       <w:r>
         <w:rPr>
@@ -1167,7 +1202,23 @@
           <w:rtl/>
           <w:lang w:val="en-US"/>
         </w:rPr>
-        <w:t>12. הגדרת משמרת כשבוע הנוכחי</w:t>
+        <w:t>12.</w:t>
+      </w:r>
+      <w:r>
+        <w:rPr>
+          <w:rFonts w:hint="cs"/>
+          <w:rtl/>
+          <w:lang w:val="en-US"/>
+        </w:rPr>
+        <w:t xml:space="preserve"> </w:t>
+      </w:r>
+      <w:r>
+        <w:rPr>
+          <w:rFonts w:hint="cs"/>
+          <w:rtl/>
+          <w:lang w:val="en-US"/>
+        </w:rPr>
+        <w:t>הצגת סטטוס המשמרות של שבוע הבא</w:t>
       </w:r>
       <w:r>
         <w:rPr>
@@ -1182,7 +1233,15 @@
           <w:rtl/>
           <w:lang w:val="en-US"/>
         </w:rPr>
-        <w:t>13. שינוי דרישות משמרת</w:t>
+        <w:t>13</w:t>
+      </w:r>
+      <w:r>
+        <w:rPr>
+          <w:rFonts w:hint="cs"/>
+          <w:rtl/>
+          <w:lang w:val="en-US"/>
+        </w:rPr>
+        <w:t>. שינוי דרישות משמרת</w:t>
       </w:r>
       <w:r>
         <w:rPr>
@@ -1193,11 +1252,17 @@
       </w:r>
       <w:r>
         <w:rPr>
-          <w:rFonts w:hint="cs"/>
-          <w:rtl/>
-          <w:lang w:val="en-US"/>
-        </w:rPr>
-        <w:t>14. הצגת עובדים זמינים למשמרת ע״פ תפקיד</w:t>
+          <w:lang w:val="en-US"/>
+        </w:rPr>
+        <w:t>14</w:t>
+      </w:r>
+      <w:r>
+        <w:rPr>
+          <w:rFonts w:hint="cs"/>
+          <w:rtl/>
+          <w:lang w:val="en-US"/>
+        </w:rPr>
+        <w:t>. הצגת עובדים זמינים למשמרת ע״פ תפקיד</w:t>
       </w:r>
       <w:r>
         <w:rPr>
@@ -1208,11 +1273,17 @@
       </w:r>
       <w:r>
         <w:rPr>
-          <w:rFonts w:hint="cs"/>
-          <w:rtl/>
-          <w:lang w:val="en-US"/>
-        </w:rPr>
-        <w:t>15. שיבוץ עובד</w:t>
+          <w:lang w:val="en-US"/>
+        </w:rPr>
+        <w:t>15</w:t>
+      </w:r>
+      <w:r>
+        <w:rPr>
+          <w:rFonts w:hint="cs"/>
+          <w:rtl/>
+          <w:lang w:val="en-US"/>
+        </w:rPr>
+        <w:t>. שיבוץ עובד</w:t>
       </w:r>
       <w:r>
         <w:rPr>
@@ -1227,7 +1298,7 @@
           <w:rtl/>
           <w:lang w:val="en-US"/>
         </w:rPr>
-        <w:t>16. צפייה במשמרות השבועיות</w:t>
+        <w:t>16. הסרת עובד ממשמרת</w:t>
       </w:r>
       <w:r>
         <w:rPr>
@@ -1242,7 +1313,15 @@
           <w:rtl/>
           <w:lang w:val="en-US"/>
         </w:rPr>
-        <w:t>17. צפייה במשמרות של שבוע הבא</w:t>
+        <w:t>17</w:t>
+      </w:r>
+      <w:r>
+        <w:rPr>
+          <w:rFonts w:hint="cs"/>
+          <w:rtl/>
+          <w:lang w:val="en-US"/>
+        </w:rPr>
+        <w:t>. צפייה במשמרות השבועיות</w:t>
       </w:r>
       <w:r>
         <w:rPr>
@@ -1257,7 +1336,15 @@
           <w:rtl/>
           <w:lang w:val="en-US"/>
         </w:rPr>
-        <w:t>18.צפייה בהיסטורית המשמרות</w:t>
+        <w:t>18</w:t>
+      </w:r>
+      <w:r>
+        <w:rPr>
+          <w:rFonts w:hint="cs"/>
+          <w:rtl/>
+          <w:lang w:val="en-US"/>
+        </w:rPr>
+        <w:t>. צפייה במשמרות של שבוע הבא</w:t>
       </w:r>
       <w:r>
         <w:rPr>
@@ -1272,7 +1359,15 @@
           <w:rtl/>
           <w:lang w:val="en-US"/>
         </w:rPr>
-        <w:t>19. צפייה בהיסטורית המשמרות ע״פ סניף</w:t>
+        <w:t>19</w:t>
+      </w:r>
+      <w:r>
+        <w:rPr>
+          <w:rFonts w:hint="cs"/>
+          <w:rtl/>
+          <w:lang w:val="en-US"/>
+        </w:rPr>
+        <w:t>.צפייה בהיסטורית המשמרות</w:t>
       </w:r>
       <w:r>
         <w:rPr>
@@ -1287,7 +1382,75 @@
           <w:rtl/>
           <w:lang w:val="en-US"/>
         </w:rPr>
-        <w:t>20. צפייה בדרישות למשמרת (נוכחית/שבוע הבא)</w:t>
+        <w:t>20</w:t>
+      </w:r>
+      <w:r>
+        <w:rPr>
+          <w:rFonts w:hint="cs"/>
+          <w:rtl/>
+          <w:lang w:val="en-US"/>
+        </w:rPr>
+        <w:t>. צפייה בהיסטורית המשמרות ע״פ סניף</w:t>
+      </w:r>
+      <w:r>
+        <w:rPr>
+          <w:rtl/>
+          <w:lang w:val="en-US"/>
+        </w:rPr>
+        <w:br/>
+      </w:r>
+      <w:r>
+        <w:rPr>
+          <w:rFonts w:hint="cs"/>
+          <w:rtl/>
+          <w:lang w:val="en-US"/>
+        </w:rPr>
+        <w:t>21</w:t>
+      </w:r>
+      <w:r>
+        <w:rPr>
+          <w:rFonts w:hint="cs"/>
+          <w:rtl/>
+          <w:lang w:val="en-US"/>
+        </w:rPr>
+        <w:t>. צפייה בדרישות למשמרת (נוכחית/שבוע הבא)</w:t>
+      </w:r>
+      <w:r>
+        <w:rPr>
+          <w:lang w:val="en-US"/>
+        </w:rPr>
+        <w:br/>
+      </w:r>
+      <w:r>
+        <w:rPr>
+          <w:rFonts w:hint="cs"/>
+          <w:rtl/>
+          <w:lang w:val="en-US"/>
+        </w:rPr>
+        <w:t>22</w:t>
+      </w:r>
+      <w:r>
+        <w:rPr>
+          <w:rFonts w:hint="cs"/>
+          <w:rtl/>
+          <w:lang w:val="en-US"/>
+        </w:rPr>
+        <w:t>. הגדרת יום מסוים כיום חופש</w:t>
+      </w:r>
+      <w:r>
+        <w:rPr>
+          <w:rtl/>
+          <w:lang w:val="en-US"/>
+        </w:rPr>
+        <w:br/>
+      </w:r>
+      <w:r>
+        <w:rPr>
+          <w:rFonts w:hint="cs"/>
+          <w:rtl/>
+          <w:lang w:val="en-US"/>
+        </w:rPr>
+        <w:t>23. פרסום המשמרות של שבוע הבא</w:t>
       </w:r>
     </w:p>
     <w:sectPr>

</xml_diff>